<commit_message>
docs: make emergency medicine department the builder
</commit_message>
<xml_diff>
--- a/docs/submission/administrative/word/01-mgb-research-management-intake.docx
+++ b/docs/submission/administrative/word/01-mgb-research-management-intake.docx
@@ -76,7 +76,7 @@
     </w:p>
     <w:p>
       <w:r>
-        <w:t xml:space="preserve">The submission would use the Harvard Affiliated Emergency Medicine Residency as the educational setting. The proposed MGB Department of Emergency Medicine Division of Artificial Intelligence would build and coordinate the curriculum. The Mass General Brigham University Healthcare Data Analytics Program would contribute applied analytics and assessment design as an internal collaborator.</w:t>
+        <w:t xml:space="preserve">The submission would use the Harvard Affiliated Emergency Medicine Residency as the educational setting. The MGB Department of Emergency Medicine would build and coordinate the curriculum. The Mass General Brigham University Healthcare Data Analytics Program would contribute applied analytics and assessment design as an internal collaborator.</w:t>
       </w:r>
     </w:p>
     <w:p>
@@ -220,7 +220,7 @@
         </w:rPr>
         <w:t xml:space="preserve">Official challenge: </w:t>
       </w:r>
-      <w:hyperlink w:history="1" r:id="rIdzcvedq_go9foynnnwj7kv">
+      <w:hyperlink w:history="1" r:id="rIdwqrxnqquzu7dasx7sptrh">
         <w:r>
           <w:rPr>
             <w:rStyle w:val="Hyperlink"/>
@@ -237,7 +237,7 @@
         </w:rPr>
         <w:t xml:space="preserve">Official Submission Guide: </w:t>
       </w:r>
-      <w:hyperlink w:history="1" r:id="rIdcuwupzqvyjlqzprwyfkfo">
+      <w:hyperlink w:history="1" r:id="rIdnttke10dyr7x-irrklh04">
         <w:r>
           <w:rPr>
             <w:rStyle w:val="Hyperlink"/>
@@ -254,7 +254,7 @@
         </w:rPr>
         <w:t xml:space="preserve">Official Participant Agreement: </w:t>
       </w:r>
-      <w:hyperlink w:history="1" r:id="rIdysh4zyaixt69-zjcpbkdc">
+      <w:hyperlink w:history="1" r:id="rIdyiywcjpzvaaksqjesvcm1">
         <w:r>
           <w:rPr>
             <w:rStyle w:val="Hyperlink"/>
@@ -340,7 +340,7 @@
         <w:t xml:space="preserve">Internal builder and coordinator:</w:t>
       </w:r>
       <w:r>
-        <w:t xml:space="preserve"> Proposed Division of Artificial Intelligence</w:t>
+        <w:t xml:space="preserve"> MGB Department of Emergency Medicine</w:t>
       </w:r>
     </w:p>
     <w:p>
@@ -429,7 +429,7 @@
         </w:rPr>
         <w:t xml:space="preserve">AMA FREIDA program record: </w:t>
       </w:r>
-      <w:hyperlink w:history="1" r:id="rIdsyc6els1kv7aty_fkzkw1">
+      <w:hyperlink w:history="1" r:id="rIdlmdnx8imuz1jnshcm2oot">
         <w:r>
           <w:rPr>
             <w:rStyle w:val="Hyperlink"/>
@@ -446,7 +446,7 @@
         </w:rPr>
         <w:t xml:space="preserve">NRMP program record: </w:t>
       </w:r>
-      <w:hyperlink w:history="1" r:id="rId_k_m-wgpkcg40qfrpituh">
+      <w:hyperlink w:history="1" r:id="rIdfpe9zaczmr93azz-frnpa">
         <w:r>
           <w:rPr>
             <w:rStyle w:val="Hyperlink"/>
@@ -496,7 +496,7 @@
         <w:t xml:space="preserve">Development environment:</w:t>
       </w:r>
       <w:r>
-        <w:t xml:space="preserve"> The Division of Artificial Intelligence may use its existing MGB Azure environment for internal development. The public curriculum will not require MGB credentials, MGB Azure access, or proprietary software.</w:t>
+        <w:t xml:space="preserve"> The Department of Emergency Medicine project team may use an approved MGB Azure environment for internal development. The public curriculum will not require MGB credentials, MGB Azure access, or proprietary software.</w:t>
       </w:r>
     </w:p>
     <w:p>
@@ -1011,19 +1011,19 @@
     </w:p>
     <w:p>
       <w:r>
-        <w:t xml:space="preserve">Department of Emergency Medicine and Division of Artificial Intelligence leadership</w:t>
-      </w:r>
-    </w:p>
-    <w:p>
-      <w:pPr>
-        <w:pStyle w:val="ListParagraph"/>
-        <w:numPr>
-          <w:ilvl w:val="0"/>
-          <w:numId w:val="2"/>
-        </w:numPr>
-      </w:pPr>
-      <w:r>
-        <w:t xml:space="preserve">Confirm departmental sponsorship of the proposed submission and the Division's builder and coordination role.</w:t>
+        <w:t xml:space="preserve">Department of Emergency Medicine leadership</w:t>
+      </w:r>
+    </w:p>
+    <w:p>
+      <w:pPr>
+        <w:pStyle w:val="ListParagraph"/>
+        <w:numPr>
+          <w:ilvl w:val="0"/>
+          <w:numId w:val="2"/>
+        </w:numPr>
+      </w:pPr>
+      <w:r>
+        <w:t xml:space="preserve">Confirm departmental sponsorship of the proposed submission and the Department's builder and coordination role.</w:t>
       </w:r>
     </w:p>
     <w:p>
@@ -1238,7 +1238,7 @@
         </w:rPr>
         <w:t xml:space="preserve">MGB Research Management: </w:t>
       </w:r>
-      <w:hyperlink w:history="1" r:id="rIdj1vk0pl832kwbo5zr5hcp">
+      <w:hyperlink w:history="1" r:id="rIdkpjhzbqrbphqlklsgm-gw">
         <w:r>
           <w:rPr>
             <w:rStyle w:val="Hyperlink"/>
@@ -1255,7 +1255,7 @@
         </w:rPr>
         <w:t xml:space="preserve">MGB Institutional Information: </w:t>
       </w:r>
-      <w:hyperlink w:history="1" r:id="rId2vnsqj7us6qfuzgj29c-q">
+      <w:hyperlink w:history="1" r:id="rIdtpznphtaxl3ozg2qgfzsr">
         <w:r>
           <w:rPr>
             <w:rStyle w:val="Hyperlink"/>

</xml_diff>

<commit_message>
docs: consolidate MGB packet into one Word file
</commit_message>
<xml_diff>
--- a/docs/submission/administrative/word/01-mgb-research-management-intake.docx
+++ b/docs/submission/administrative/word/01-mgb-research-management-intake.docx
@@ -10,7 +10,7 @@
         </w:pBdr>
       </w:pPr>
       <w:r>
-        <w:t xml:space="preserve">Research Management intake and clearance request</w:t>
+        <w:t xml:space="preserve">Research Management intake and institutional authorization</w:t>
       </w:r>
     </w:p>
     <w:p>
@@ -220,7 +220,7 @@
         </w:rPr>
         <w:t xml:space="preserve">Official challenge: </w:t>
       </w:r>
-      <w:hyperlink w:history="1" r:id="rIdwqrxnqquzu7dasx7sptrh">
+      <w:hyperlink w:history="1" r:id="rIdlhggtatvxefnt9shyhi3u">
         <w:r>
           <w:rPr>
             <w:rStyle w:val="Hyperlink"/>
@@ -237,7 +237,7 @@
         </w:rPr>
         <w:t xml:space="preserve">Official Submission Guide: </w:t>
       </w:r>
-      <w:hyperlink w:history="1" r:id="rIdnttke10dyr7x-irrklh04">
+      <w:hyperlink w:history="1" r:id="rId2r0tuy6vnt2ysy7a8agv0">
         <w:r>
           <w:rPr>
             <w:rStyle w:val="Hyperlink"/>
@@ -254,7 +254,7 @@
         </w:rPr>
         <w:t xml:space="preserve">Official Participant Agreement: </w:t>
       </w:r>
-      <w:hyperlink w:history="1" r:id="rIdyiywcjpzvaaksqjesvcm1">
+      <w:hyperlink w:history="1" r:id="rIdulyoxun9s4ntfhgvcpk2-">
         <w:r>
           <w:rPr>
             <w:rStyle w:val="Hyperlink"/>
@@ -429,7 +429,7 @@
         </w:rPr>
         <w:t xml:space="preserve">AMA FREIDA program record: </w:t>
       </w:r>
-      <w:hyperlink w:history="1" r:id="rIdlmdnx8imuz1jnshcm2oot">
+      <w:hyperlink w:history="1" r:id="rIdqesvh_-apdgyvpgaiyrju">
         <w:r>
           <w:rPr>
             <w:rStyle w:val="Hyperlink"/>
@@ -446,7 +446,7 @@
         </w:rPr>
         <w:t xml:space="preserve">NRMP program record: </w:t>
       </w:r>
-      <w:hyperlink w:history="1" r:id="rIdfpe9zaczmr93azz-frnpa">
+      <w:hyperlink w:history="1" r:id="rId3zmdrdddls7hv1toukdpx">
         <w:r>
           <w:rPr>
             <w:rStyle w:val="Hyperlink"/>
@@ -538,6 +538,285 @@
     </w:p>
     <w:p>
       <w:pPr>
+        <w:ind w:left="280"/>
+      </w:pPr>
+      <w:r>
+        <w:rPr>
+          <w:b/>
+          <w:bCs/>
+        </w:rPr>
+        <w:t xml:space="preserve">[ ] Human subjects research at the submission stage:</w:t>
+      </w:r>
+      <w:r>
+        <w:t xml:space="preserve"> No.</w:t>
+      </w:r>
+    </w:p>
+    <w:p>
+      <w:pPr>
+        <w:ind w:left="280"/>
+      </w:pPr>
+      <w:r>
+        <w:t xml:space="preserve">[ ] Protected health information or identifiable patient data: No.</w:t>
+      </w:r>
+    </w:p>
+    <w:p>
+      <w:pPr>
+        <w:ind w:left="280"/>
+      </w:pPr>
+      <w:r>
+        <w:t xml:space="preserve">[ ] Access to MGB clinical systems or real patient records: No.</w:t>
+      </w:r>
+    </w:p>
+    <w:p>
+      <w:pPr>
+        <w:ind w:left="280"/>
+      </w:pPr>
+      <w:r>
+        <w:t xml:space="preserve">[ ] Patient-facing AI, clinical decision support, or clinical deployment: No.</w:t>
+      </w:r>
+    </w:p>
+    <w:p>
+      <w:pPr>
+        <w:ind w:left="280"/>
+      </w:pPr>
+      <w:r>
+        <w:t xml:space="preserve">[ ] New data use agreement, business associate agreement, or material transfer agreement: No.</w:t>
+      </w:r>
+    </w:p>
+    <w:p>
+      <w:pPr>
+        <w:ind w:left="280"/>
+      </w:pPr>
+      <w:r>
+        <w:t xml:space="preserve">[ ] New external vendor or software procurement for submission preparation: No.</w:t>
+      </w:r>
+    </w:p>
+    <w:p>
+      <w:pPr>
+        <w:ind w:left="280"/>
+      </w:pPr>
+      <w:r>
+        <w:t xml:space="preserve">[ ] New subrecipient, consultant agreement, or external prize split: No.</w:t>
+      </w:r>
+    </w:p>
+    <w:p>
+      <w:pPr>
+        <w:ind w:left="280"/>
+      </w:pPr>
+      <w:r>
+        <w:t xml:space="preserve">[ ] Application budget, indirect cost request, or cost share: No.</w:t>
+      </w:r>
+    </w:p>
+    <w:p>
+      <w:pPr>
+        <w:ind w:left="280"/>
+      </w:pPr>
+      <w:r>
+        <w:t xml:space="preserve">[ ] Public dissemination of submitted educational materials: Yes, subject to the challenge terms and MGB approval.</w:t>
+      </w:r>
+    </w:p>
+    <w:p>
+      <w:pPr>
+        <w:ind w:left="280"/>
+      </w:pPr>
+      <w:r>
+        <w:rPr>
+          <w:b/>
+          <w:bCs/>
+        </w:rPr>
+        <w:t xml:space="preserve">[ ] Potential institutional prize receipt if selected:</w:t>
+      </w:r>
+      <w:r>
+        <w:t xml:space="preserve"> Yes.</w:t>
+      </w:r>
+    </w:p>
+    <w:p>
+      <w:pPr>
+        <w:ind w:left="280"/>
+      </w:pPr>
+      <w:r>
+        <w:t xml:space="preserve">[ ] Later use of institutional data or formal learner research: Not included in this submission. Any later activity would follow the applicable MGB review process before it begins.</w:t>
+      </w:r>
+    </w:p>
+    <w:p>
+      <w:pPr>
+        <w:pStyle w:val="Heading1"/>
+      </w:pPr>
+      <w:r>
+        <w:t xml:space="preserve">Sponsor terms that require institutional review</w:t>
+      </w:r>
+    </w:p>
+    <w:p>
+      <w:r>
+        <w:rPr>
+          <w:b/>
+          <w:bCs/>
+        </w:rPr>
+        <w:t xml:space="preserve">One-entry certification:</w:t>
+      </w:r>
+      <w:r>
+        <w:t xml:space="preserve"> The Lead Entity must confirm that this is its only entry, individually or through a formal partnership.</w:t>
+      </w:r>
+    </w:p>
+    <w:p>
+      <w:r>
+        <w:rPr>
+          <w:b/>
+          <w:bCs/>
+        </w:rPr>
+        <w:t xml:space="preserve">Authority certification:</w:t>
+      </w:r>
+      <w:r>
+        <w:t xml:space="preserve"> The Participant Agreement must be completed for the Lead Entity and signed through the route approved by MGB. The proposed Point of Contact needs authority to register, communicate, and submit on behalf of the institution.</w:t>
+      </w:r>
+    </w:p>
+    <w:p>
+      <w:r>
+        <w:rPr>
+          <w:b/>
+          <w:bCs/>
+        </w:rPr>
+        <w:t xml:space="preserve">Public-use license:</w:t>
+      </w:r>
+      <w:r>
+        <w:t xml:space="preserve"> Participating entities grant NIH an irrevocable, paid-up, royalty-free, nonexclusive worldwide license to reproduce, publish, post, link to, share, and publicly display the submission for challenge purposes. The participating entities retain their other applicable intellectual property rights.</w:t>
+      </w:r>
+    </w:p>
+    <w:p>
+      <w:r>
+        <w:rPr>
+          <w:b/>
+          <w:bCs/>
+        </w:rPr>
+        <w:t xml:space="preserve">Federal funding restriction:</w:t>
+      </w:r>
+      <w:r>
+        <w:t xml:space="preserve"> Federal grant, cooperative agreement, or other transaction funds may not be used to develop or support the submission. The department and Research Management should confirm an allowable source for staff effort and any internal computing used to prepare the entry.</w:t>
+      </w:r>
+    </w:p>
+    <w:p>
+      <w:r>
+        <w:rPr>
+          <w:b/>
+          <w:bCs/>
+        </w:rPr>
+        <w:t xml:space="preserve">Prize acceptance:</w:t>
+      </w:r>
+      <w:r>
+        <w:t xml:space="preserve"> MGB should identify the legal payee, financial account route, tax or reporting treatment, and institutional owner of any prize funds before submission.</w:t>
+      </w:r>
+    </w:p>
+    <w:p>
+      <w:pPr>
+        <w:pStyle w:val="Heading1"/>
+      </w:pPr>
+      <w:r>
+        <w:t xml:space="preserve">Classification and routing questions for Research Management</w:t>
+      </w:r>
+    </w:p>
+    <w:p>
+      <w:pPr>
+        <w:ind w:left="280"/>
+      </w:pPr>
+      <w:r>
+        <w:t xml:space="preserve">[ ] Which legal entity should appear as the Lead Entity, and what legal address should be used?</w:t>
+      </w:r>
+    </w:p>
+    <w:p>
+      <w:pPr>
+        <w:ind w:left="280"/>
+      </w:pPr>
+      <w:r>
+        <w:t xml:space="preserve">[ ] Does Research Management, GME, another MGB office, or a combined route own this prize submission?</w:t>
+      </w:r>
+    </w:p>
+    <w:p>
+      <w:pPr>
+        <w:ind w:left="280"/>
+      </w:pPr>
+      <w:r>
+        <w:t xml:space="preserve">[ ] Is an Insight record or another internal proposal or agreement record required?</w:t>
+      </w:r>
+    </w:p>
+    <w:p>
+      <w:pPr>
+        <w:ind w:left="280"/>
+      </w:pPr>
+      <w:r>
+        <w:t xml:space="preserve">[ ] Is this submission eligible through HAEMR and ACGME program 1102421150?</w:t>
+      </w:r>
+    </w:p>
+    <w:p>
+      <w:pPr>
+        <w:ind w:left="280"/>
+      </w:pPr>
+      <w:r>
+        <w:t xml:space="preserve">[ ] Is MGB's one permitted entry available for this challenge?</w:t>
+      </w:r>
+    </w:p>
+    <w:p>
+      <w:pPr>
+        <w:ind w:left="280"/>
+      </w:pPr>
+      <w:r>
+        <w:t xml:space="preserve">[ ] May MGB University Healthcare Data Analytics be listed as an internal collaborator without formal Partner Entity status?</w:t>
+      </w:r>
+    </w:p>
+    <w:p>
+      <w:pPr>
+        <w:ind w:left="280"/>
+      </w:pPr>
+      <w:r>
+        <w:t xml:space="preserve">[ ] May Shuhan He, MD, serve as the authorized institutional Point of Contact?</w:t>
+      </w:r>
+    </w:p>
+    <w:p>
+      <w:pPr>
+        <w:ind w:left="280"/>
+      </w:pPr>
+      <w:r>
+        <w:t xml:space="preserve">[ ] Who may sign the official Participant Agreement for the Lead Entity?</w:t>
+      </w:r>
+    </w:p>
+    <w:p>
+      <w:pPr>
+        <w:ind w:left="280"/>
+      </w:pPr>
+      <w:r>
+        <w:t xml:space="preserve">[ ] Which office will review the public-use license and open curriculum release?</w:t>
+      </w:r>
+    </w:p>
+    <w:p>
+      <w:pPr>
+        <w:ind w:left="280"/>
+      </w:pPr>
+      <w:r>
+        <w:t xml:space="preserve">[ ] Which office will receive and administer the prize if selected?</w:t>
+      </w:r>
+    </w:p>
+    <w:p>
+      <w:pPr>
+        <w:ind w:left="280"/>
+      </w:pPr>
+      <w:r>
+        <w:t xml:space="preserve">[ ] Do the stated data and educational activities require any additional privacy, information security, human research, or clinical AI review before submission?</w:t>
+      </w:r>
+    </w:p>
+    <w:p>
+      <w:pPr>
+        <w:pStyle w:val="Heading1"/>
+      </w:pPr>
+      <w:r>
+        <w:t xml:space="preserve">Requested institutional actions</w:t>
+      </w:r>
+    </w:p>
+    <w:p>
+      <w:r>
+        <w:t xml:space="preserve">Research Management or designated submission office</w:t>
+      </w:r>
+    </w:p>
+    <w:p>
+      <w:pPr>
         <w:pStyle w:val="ListParagraph"/>
         <w:numPr>
           <w:ilvl w:val="0"/>
@@ -545,14 +824,7 @@
         </w:numPr>
       </w:pPr>
       <w:r>
-        <w:rPr>
-          <w:b/>
-          <w:bCs/>
-        </w:rPr>
-        <w:t xml:space="preserve">[ ] Human subjects research at the submission stage:</w:t>
-      </w:r>
-      <w:r>
-        <w:t xml:space="preserve"> No.</w:t>
+        <w:t xml:space="preserve">Classify the opportunity and assign the internal route.</w:t>
       </w:r>
     </w:p>
     <w:p>
@@ -564,7 +836,7 @@
         </w:numPr>
       </w:pPr>
       <w:r>
-        <w:t xml:space="preserve">[ ] Protected health information or identifiable patient data: No.</w:t>
+        <w:t xml:space="preserve">Confirm the legal Lead Entity, one-entry availability, and institutional eligibility.</w:t>
       </w:r>
     </w:p>
     <w:p>
@@ -576,7 +848,7 @@
         </w:numPr>
       </w:pPr>
       <w:r>
-        <w:t xml:space="preserve">[ ] Access to MGB clinical systems or real patient records: No.</w:t>
+        <w:t xml:space="preserve">Authorize the Point of Contact or identify a different authorized submitter.</w:t>
       </w:r>
     </w:p>
     <w:p>
@@ -588,7 +860,12 @@
         </w:numPr>
       </w:pPr>
       <w:r>
-        <w:t xml:space="preserve">[ ] Patient-facing AI, clinical decision support, or clinical deployment: No.</w:t>
+        <w:t xml:space="preserve">Identify the Participant Agreement signer and required approval sequence.</w:t>
+      </w:r>
+    </w:p>
+    <w:p>
+      <w:r>
+        <w:t xml:space="preserve">Research Management Contracts or legal reviewer</w:t>
       </w:r>
     </w:p>
     <w:p>
@@ -600,7 +877,7 @@
         </w:numPr>
       </w:pPr>
       <w:r>
-        <w:t xml:space="preserve">[ ] New data use agreement, business associate agreement, or material transfer agreement: No.</w:t>
+        <w:t xml:space="preserve">Review the Participant Agreement, public-use license, certifications, and prize terms.</w:t>
       </w:r>
     </w:p>
     <w:p>
@@ -612,7 +889,12 @@
         </w:numPr>
       </w:pPr>
       <w:r>
-        <w:t xml:space="preserve">[ ] New external vendor or software procurement for submission preparation: No.</w:t>
+        <w:t xml:space="preserve">Confirm whether any separate agreement record is required.</w:t>
+      </w:r>
+    </w:p>
+    <w:p>
+      <w:r>
+        <w:t xml:space="preserve">Graduate Medical Education and HAEMR</w:t>
       </w:r>
     </w:p>
     <w:p>
@@ -624,7 +906,7 @@
         </w:numPr>
       </w:pPr>
       <w:r>
-        <w:t xml:space="preserve">[ ] New subrecipient, consultant agreement, or external prize split: No.</w:t>
+        <w:t xml:space="preserve">Verify the residency program record and educational setting.</w:t>
       </w:r>
     </w:p>
     <w:p>
@@ -636,7 +918,12 @@
         </w:numPr>
       </w:pPr>
       <w:r>
-        <w:t xml:space="preserve">[ ] Application budget, indirect cost request, or cost share: No.</w:t>
+        <w:t xml:space="preserve">Confirm that HAEMR may be named in the submission and may participate in curriculum development and implementation.</w:t>
+      </w:r>
+    </w:p>
+    <w:p>
+      <w:r>
+        <w:t xml:space="preserve">Department of Emergency Medicine leadership</w:t>
       </w:r>
     </w:p>
     <w:p>
@@ -648,7 +935,7 @@
         </w:numPr>
       </w:pPr>
       <w:r>
-        <w:t xml:space="preserve">[ ] Public dissemination of submitted educational materials: Yes, subject to the challenge terms and MGB approval.</w:t>
+        <w:t xml:space="preserve">Confirm departmental sponsorship of the proposed submission and the Department's builder and coordination role.</w:t>
       </w:r>
     </w:p>
     <w:p>
@@ -660,14 +947,12 @@
         </w:numPr>
       </w:pPr>
       <w:r>
-        <w:rPr>
-          <w:b/>
-          <w:bCs/>
-        </w:rPr>
-        <w:t xml:space="preserve">[ ] Potential institutional prize receipt if selected:</w:t>
-      </w:r>
-      <w:r>
-        <w:t xml:space="preserve"> Yes.</w:t>
+        <w:t xml:space="preserve">Confirm a permissible nonfederal source for submission preparation effort and computing.</w:t>
+      </w:r>
+    </w:p>
+    <w:p>
+      <w:r>
+        <w:t xml:space="preserve">Research Finance or designated financial office</w:t>
       </w:r>
     </w:p>
     <w:p>
@@ -679,7 +964,7 @@
         </w:numPr>
       </w:pPr>
       <w:r>
-        <w:t xml:space="preserve">[ ] Later use of institutional data or formal learner research: Not included in this submission. Any later activity would follow the applicable MGB review process before it begins.</w:t>
+        <w:t xml:space="preserve">Confirm the institutional prize acceptance and account route if selected.</w:t>
       </w:r>
     </w:p>
     <w:p>
@@ -687,75 +972,7 @@
         <w:pStyle w:val="Heading1"/>
       </w:pPr>
       <w:r>
-        <w:t xml:space="preserve">Sponsor terms that require institutional review</w:t>
-      </w:r>
-    </w:p>
-    <w:p>
-      <w:r>
-        <w:rPr>
-          <w:b/>
-          <w:bCs/>
-        </w:rPr>
-        <w:t xml:space="preserve">One-entry certification:</w:t>
-      </w:r>
-      <w:r>
-        <w:t xml:space="preserve"> The Lead Entity must confirm that this is its only entry, individually or through a formal partnership.</w:t>
-      </w:r>
-    </w:p>
-    <w:p>
-      <w:r>
-        <w:rPr>
-          <w:b/>
-          <w:bCs/>
-        </w:rPr>
-        <w:t xml:space="preserve">Authority certification:</w:t>
-      </w:r>
-      <w:r>
-        <w:t xml:space="preserve"> The Participant Agreement must be completed for the Lead Entity and signed through the route approved by MGB. The proposed Point of Contact needs authority to register, communicate, and submit on behalf of the institution.</w:t>
-      </w:r>
-    </w:p>
-    <w:p>
-      <w:r>
-        <w:rPr>
-          <w:b/>
-          <w:bCs/>
-        </w:rPr>
-        <w:t xml:space="preserve">Public-use license:</w:t>
-      </w:r>
-      <w:r>
-        <w:t xml:space="preserve"> Participating entities grant NIH an irrevocable, paid-up, royalty-free, nonexclusive worldwide license to reproduce, publish, post, link to, share, and publicly display the submission for challenge purposes. The participating entities retain their other applicable intellectual property rights.</w:t>
-      </w:r>
-    </w:p>
-    <w:p>
-      <w:r>
-        <w:rPr>
-          <w:b/>
-          <w:bCs/>
-        </w:rPr>
-        <w:t xml:space="preserve">Federal funding restriction:</w:t>
-      </w:r>
-      <w:r>
-        <w:t xml:space="preserve"> Federal grant, cooperative agreement, or other transaction funds may not be used to develop or support the submission. The department and Research Management should confirm an allowable source for staff effort and any internal computing used to prepare the entry.</w:t>
-      </w:r>
-    </w:p>
-    <w:p>
-      <w:r>
-        <w:rPr>
-          <w:b/>
-          <w:bCs/>
-        </w:rPr>
-        <w:t xml:space="preserve">Prize acceptance:</w:t>
-      </w:r>
-      <w:r>
-        <w:t xml:space="preserve"> MGB should identify the legal payee, financial account route, tax or reporting treatment, and institutional owner of any prize funds before submission.</w:t>
-      </w:r>
-    </w:p>
-    <w:p>
-      <w:pPr>
-        <w:pStyle w:val="Heading1"/>
-      </w:pPr>
-      <w:r>
-        <w:t xml:space="preserve">Classification and routing questions for Research Management</w:t>
+        <w:t xml:space="preserve">Materials available for review</w:t>
       </w:r>
     </w:p>
     <w:p>
@@ -767,7 +984,7 @@
         </w:numPr>
       </w:pPr>
       <w:r>
-        <w:t xml:space="preserve">[ ] Which legal entity should appear as the Lead Entity, and what legal address should be used?</w:t>
+        <w:t xml:space="preserve">Official NIH challenge rules, Submission Guide, and Participant Agreement.</w:t>
       </w:r>
     </w:p>
     <w:p>
@@ -779,7 +996,7 @@
         </w:numPr>
       </w:pPr>
       <w:r>
-        <w:t xml:space="preserve">[ ] Does Research Management, GME, another MGB office, or a combined route own this prize submission?</w:t>
+        <w:t xml:space="preserve">Current HAEMR national program records.</w:t>
       </w:r>
     </w:p>
     <w:p>
@@ -791,7 +1008,7 @@
         </w:numPr>
       </w:pPr>
       <w:r>
-        <w:t xml:space="preserve">[ ] Is an Insight record or another internal proposal or agreement record required?</w:t>
+        <w:t xml:space="preserve">North Star specification and 40-hour HHS competency crosswalk.</w:t>
       </w:r>
     </w:p>
     <w:p>
@@ -803,91 +1020,7 @@
         </w:numPr>
       </w:pPr>
       <w:r>
-        <w:t xml:space="preserve">[ ] Is this submission eligible through HAEMR and ACGME program 1102421150?</w:t>
-      </w:r>
-    </w:p>
-    <w:p>
-      <w:pPr>
-        <w:pStyle w:val="ListParagraph"/>
-        <w:numPr>
-          <w:ilvl w:val="0"/>
-          <w:numId w:val="2"/>
-        </w:numPr>
-      </w:pPr>
-      <w:r>
-        <w:t xml:space="preserve">[ ] Is MGB's one permitted entry available for this challenge?</w:t>
-      </w:r>
-    </w:p>
-    <w:p>
-      <w:pPr>
-        <w:pStyle w:val="ListParagraph"/>
-        <w:numPr>
-          <w:ilvl w:val="0"/>
-          <w:numId w:val="2"/>
-        </w:numPr>
-      </w:pPr>
-      <w:r>
-        <w:t xml:space="preserve">[ ] May MGB University Healthcare Data Analytics be listed as an internal collaborator without formal Partner Entity status?</w:t>
-      </w:r>
-    </w:p>
-    <w:p>
-      <w:pPr>
-        <w:pStyle w:val="ListParagraph"/>
-        <w:numPr>
-          <w:ilvl w:val="0"/>
-          <w:numId w:val="2"/>
-        </w:numPr>
-      </w:pPr>
-      <w:r>
-        <w:t xml:space="preserve">[ ] May Shuhan He, MD, serve as the authorized institutional Point of Contact?</w:t>
-      </w:r>
-    </w:p>
-    <w:p>
-      <w:pPr>
-        <w:pStyle w:val="ListParagraph"/>
-        <w:numPr>
-          <w:ilvl w:val="0"/>
-          <w:numId w:val="2"/>
-        </w:numPr>
-      </w:pPr>
-      <w:r>
-        <w:t xml:space="preserve">[ ] Who may sign the official Participant Agreement for the Lead Entity?</w:t>
-      </w:r>
-    </w:p>
-    <w:p>
-      <w:pPr>
-        <w:pStyle w:val="ListParagraph"/>
-        <w:numPr>
-          <w:ilvl w:val="0"/>
-          <w:numId w:val="2"/>
-        </w:numPr>
-      </w:pPr>
-      <w:r>
-        <w:t xml:space="preserve">[ ] Which office will review the public-use license and open curriculum release?</w:t>
-      </w:r>
-    </w:p>
-    <w:p>
-      <w:pPr>
-        <w:pStyle w:val="ListParagraph"/>
-        <w:numPr>
-          <w:ilvl w:val="0"/>
-          <w:numId w:val="2"/>
-        </w:numPr>
-      </w:pPr>
-      <w:r>
-        <w:t xml:space="preserve">[ ] Which office will receive and administer the prize if selected?</w:t>
-      </w:r>
-    </w:p>
-    <w:p>
-      <w:pPr>
-        <w:pStyle w:val="ListParagraph"/>
-        <w:numPr>
-          <w:ilvl w:val="0"/>
-          <w:numId w:val="2"/>
-        </w:numPr>
-      </w:pPr>
-      <w:r>
-        <w:t xml:space="preserve">[ ] Do the stated data and educational activities require any additional privacy, information security, human research, or clinical AI review before submission?</w:t>
+        <w:t xml:space="preserve">Draft Curriculum Overview and Nutrition Education Toolkit as they are completed.</w:t>
       </w:r>
     </w:p>
     <w:p>
@@ -895,164 +1028,82 @@
         <w:pStyle w:val="Heading1"/>
       </w:pPr>
       <w:r>
-        <w:t xml:space="preserve">Requested institutional actions</w:t>
-      </w:r>
-    </w:p>
-    <w:p>
-      <w:r>
-        <w:t xml:space="preserve">Research Management or designated submission office</w:t>
-      </w:r>
-    </w:p>
-    <w:p>
-      <w:pPr>
-        <w:pStyle w:val="ListParagraph"/>
-        <w:numPr>
-          <w:ilvl w:val="0"/>
-          <w:numId w:val="2"/>
-        </w:numPr>
-      </w:pPr>
-      <w:r>
-        <w:t xml:space="preserve">Classify the opportunity and assign the internal route.</w:t>
-      </w:r>
-    </w:p>
-    <w:p>
-      <w:pPr>
-        <w:pStyle w:val="ListParagraph"/>
-        <w:numPr>
-          <w:ilvl w:val="0"/>
-          <w:numId w:val="2"/>
-        </w:numPr>
-      </w:pPr>
-      <w:r>
-        <w:t xml:space="preserve">Confirm the legal Lead Entity, one-entry availability, and institutional eligibility.</w:t>
-      </w:r>
-    </w:p>
-    <w:p>
-      <w:pPr>
-        <w:pStyle w:val="ListParagraph"/>
-        <w:numPr>
-          <w:ilvl w:val="0"/>
-          <w:numId w:val="2"/>
-        </w:numPr>
-      </w:pPr>
-      <w:r>
-        <w:t xml:space="preserve">Authorize the Point of Contact or identify a different authorized submitter.</w:t>
-      </w:r>
-    </w:p>
-    <w:p>
-      <w:pPr>
-        <w:pStyle w:val="ListParagraph"/>
-        <w:numPr>
-          <w:ilvl w:val="0"/>
-          <w:numId w:val="2"/>
-        </w:numPr>
-      </w:pPr>
-      <w:r>
-        <w:t xml:space="preserve">Identify the Participant Agreement signer and required approval sequence.</w:t>
-      </w:r>
-    </w:p>
-    <w:p>
-      <w:r>
-        <w:t xml:space="preserve">Research Management Contracts or legal reviewer</w:t>
-      </w:r>
-    </w:p>
-    <w:p>
-      <w:pPr>
-        <w:pStyle w:val="ListParagraph"/>
-        <w:numPr>
-          <w:ilvl w:val="0"/>
-          <w:numId w:val="2"/>
-        </w:numPr>
-      </w:pPr>
-      <w:r>
-        <w:t xml:space="preserve">Review the Participant Agreement, public-use license, certifications, and prize terms.</w:t>
-      </w:r>
-    </w:p>
-    <w:p>
-      <w:pPr>
-        <w:pStyle w:val="ListParagraph"/>
-        <w:numPr>
-          <w:ilvl w:val="0"/>
-          <w:numId w:val="2"/>
-        </w:numPr>
-      </w:pPr>
-      <w:r>
-        <w:t xml:space="preserve">Confirm whether any separate agreement record is required.</w:t>
-      </w:r>
-    </w:p>
-    <w:p>
-      <w:r>
-        <w:t xml:space="preserve">Graduate Medical Education and HAEMR</w:t>
-      </w:r>
-    </w:p>
-    <w:p>
-      <w:pPr>
-        <w:pStyle w:val="ListParagraph"/>
-        <w:numPr>
-          <w:ilvl w:val="0"/>
-          <w:numId w:val="2"/>
-        </w:numPr>
-      </w:pPr>
-      <w:r>
-        <w:t xml:space="preserve">Verify the residency program record and educational setting.</w:t>
-      </w:r>
-    </w:p>
-    <w:p>
-      <w:pPr>
-        <w:pStyle w:val="ListParagraph"/>
-        <w:numPr>
-          <w:ilvl w:val="0"/>
-          <w:numId w:val="2"/>
-        </w:numPr>
-      </w:pPr>
-      <w:r>
-        <w:t xml:space="preserve">Confirm that HAEMR may be named in the submission and may participate in curriculum development and implementation.</w:t>
-      </w:r>
-    </w:p>
-    <w:p>
-      <w:r>
-        <w:t xml:space="preserve">Department of Emergency Medicine leadership</w:t>
-      </w:r>
-    </w:p>
-    <w:p>
-      <w:pPr>
-        <w:pStyle w:val="ListParagraph"/>
-        <w:numPr>
-          <w:ilvl w:val="0"/>
-          <w:numId w:val="2"/>
-        </w:numPr>
-      </w:pPr>
-      <w:r>
-        <w:t xml:space="preserve">Confirm departmental sponsorship of the proposed submission and the Department's builder and coordination role.</w:t>
-      </w:r>
-    </w:p>
-    <w:p>
-      <w:pPr>
-        <w:pStyle w:val="ListParagraph"/>
-        <w:numPr>
-          <w:ilvl w:val="0"/>
-          <w:numId w:val="2"/>
-        </w:numPr>
-      </w:pPr>
-      <w:r>
-        <w:t xml:space="preserve">Confirm a permissible nonfederal source for submission preparation effort and computing.</w:t>
-      </w:r>
-    </w:p>
-    <w:p>
-      <w:r>
-        <w:t xml:space="preserve">Research Finance or designated financial office</w:t>
-      </w:r>
-    </w:p>
-    <w:p>
-      <w:pPr>
-        <w:pStyle w:val="ListParagraph"/>
-        <w:numPr>
-          <w:ilvl w:val="0"/>
-          <w:numId w:val="2"/>
-        </w:numPr>
-      </w:pPr>
-      <w:r>
-        <w:t xml:space="preserve">Confirm the institutional prize acceptance and account route if selected.</w:t>
+        <w:t xml:space="preserve">Requested disposition</w:t>
+      </w:r>
+    </w:p>
+    <w:p>
+      <w:pPr>
+        <w:ind w:left="280"/>
+      </w:pPr>
+      <w:r>
+        <w:t xml:space="preserve">[ ] Proceed through Research Management or the designated MGB submission route.</w:t>
+      </w:r>
+    </w:p>
+    <w:p>
+      <w:pPr>
+        <w:ind w:left="280"/>
+      </w:pPr>
+      <w:r>
+        <w:t xml:space="preserve">[ ] Proceed after the listed conditions are met.</w:t>
+      </w:r>
+    </w:p>
+    <w:p>
+      <w:pPr>
+        <w:ind w:left="280"/>
+      </w:pPr>
+      <w:r>
+        <w:rPr>
+          <w:b/>
+          <w:bCs/>
+        </w:rPr>
+        <w:t xml:space="preserve">[ ] Route outside Research Management to:</w:t>
+      </w:r>
+      <w:r>
+        <w:t xml:space="preserve"> ______________________________</w:t>
+      </w:r>
+    </w:p>
+    <w:p>
+      <w:pPr>
+        <w:ind w:left="280"/>
+      </w:pPr>
+      <w:r>
+        <w:t xml:space="preserve">[ ] Do not proceed.</w:t>
+      </w:r>
+    </w:p>
+    <w:p>
+      <w:r>
+        <w:rPr>
+          <w:b/>
+          <w:bCs/>
+        </w:rPr>
+        <w:t xml:space="preserve">Conditions, owner, and due date:</w:t>
+      </w:r>
+      <w:r>
+        <w:t xml:space="preserve"> _________________________________________</w:t>
+      </w:r>
+    </w:p>
+    <w:p>
+      <w:r>
+        <w:rPr>
+          <w:b/>
+          <w:bCs/>
+        </w:rPr>
+        <w:t xml:space="preserve">Administrative owner:</w:t>
+      </w:r>
+      <w:r>
+        <w:t xml:space="preserve"> __________________________________________________</w:t>
+      </w:r>
+    </w:p>
+    <w:p>
+      <w:r>
+        <w:rPr>
+          <w:b/>
+          <w:bCs/>
+        </w:rPr>
+        <w:t xml:space="preserve">Decision date:</w:t>
+      </w:r>
+      <w:r>
+        <w:t xml:space="preserve"> __________________________________________________________</w:t>
       </w:r>
     </w:p>
     <w:p>
@@ -1060,67 +1111,67 @@
         <w:pStyle w:val="Heading1"/>
       </w:pPr>
       <w:r>
-        <w:t xml:space="preserve">Materials available for review</w:t>
-      </w:r>
-    </w:p>
-    <w:p>
-      <w:pPr>
-        <w:pStyle w:val="ListParagraph"/>
-        <w:numPr>
-          <w:ilvl w:val="0"/>
-          <w:numId w:val="2"/>
-        </w:numPr>
-      </w:pPr>
-      <w:r>
-        <w:t xml:space="preserve">Official NIH challenge rules, Submission Guide, and Participant Agreement.</w:t>
-      </w:r>
-    </w:p>
-    <w:p>
-      <w:pPr>
-        <w:pStyle w:val="ListParagraph"/>
-        <w:numPr>
-          <w:ilvl w:val="0"/>
-          <w:numId w:val="2"/>
-        </w:numPr>
-      </w:pPr>
-      <w:r>
-        <w:t xml:space="preserve">Current HAEMR national program records.</w:t>
-      </w:r>
-    </w:p>
-    <w:p>
-      <w:pPr>
-        <w:pStyle w:val="ListParagraph"/>
-        <w:numPr>
-          <w:ilvl w:val="0"/>
-          <w:numId w:val="2"/>
-        </w:numPr>
-      </w:pPr>
-      <w:r>
-        <w:t xml:space="preserve">North Star specification and 40-hour HHS competency crosswalk.</w:t>
-      </w:r>
-    </w:p>
-    <w:p>
-      <w:pPr>
-        <w:pStyle w:val="ListParagraph"/>
-        <w:numPr>
-          <w:ilvl w:val="0"/>
-          <w:numId w:val="2"/>
-        </w:numPr>
-      </w:pPr>
-      <w:r>
-        <w:t xml:space="preserve">Draft Curriculum Overview and Nutrition Education Toolkit as they are completed.</w:t>
-      </w:r>
-    </w:p>
-    <w:p>
-      <w:pPr>
-        <w:pStyle w:val="ListParagraph"/>
-        <w:numPr>
-          <w:ilvl w:val="0"/>
-          <w:numId w:val="2"/>
-        </w:numPr>
-      </w:pPr>
-      <w:r>
-        <w:t xml:space="preserve">Optional support letters if an approving office requests them.</w:t>
+        <w:t xml:space="preserve">Institutional identity and routing record</w:t>
+      </w:r>
+    </w:p>
+    <w:p>
+      <w:r>
+        <w:rPr>
+          <w:b/>
+          <w:bCs/>
+        </w:rPr>
+        <w:t xml:space="preserve">Confirmed legal Lead Entity name:</w:t>
+      </w:r>
+      <w:r>
+        <w:t xml:space="preserve"> _______________________________________</w:t>
+      </w:r>
+    </w:p>
+    <w:p>
+      <w:r>
+        <w:rPr>
+          <w:b/>
+          <w:bCs/>
+        </w:rPr>
+        <w:t xml:space="preserve">Legal address for Participant Agreement:</w:t>
+      </w:r>
+      <w:r>
+        <w:t xml:space="preserve"> ________________________________</w:t>
+      </w:r>
+    </w:p>
+    <w:p>
+      <w:r>
+        <w:rPr>
+          <w:b/>
+          <w:bCs/>
+        </w:rPr>
+        <w:t xml:space="preserve">Institutional identifier or UEI, if required:</w:t>
+      </w:r>
+      <w:r>
+        <w:t xml:space="preserve"> ___________________________</w:t>
+      </w:r>
+    </w:p>
+    <w:p>
+      <w:r>
+        <w:rPr>
+          <w:b/>
+          <w:bCs/>
+        </w:rPr>
+        <w:t xml:space="preserve">Internal routing or Insight record number, if required:</w:t>
+      </w:r>
+      <w:r>
+        <w:t xml:space="preserve"> _________________</w:t>
+      </w:r>
+    </w:p>
+    <w:p>
+      <w:r>
+        <w:rPr>
+          <w:b/>
+          <w:bCs/>
+        </w:rPr>
+        <w:t xml:space="preserve">Administrative owner:</w:t>
+      </w:r>
+      <w:r>
+        <w:t xml:space="preserve"> __________________________________________________</w:t>
       </w:r>
     </w:p>
     <w:p>
@@ -1128,83 +1179,92 @@
         <w:pStyle w:val="Heading1"/>
       </w:pPr>
       <w:r>
-        <w:t xml:space="preserve">Requested disposition</w:t>
-      </w:r>
-    </w:p>
-    <w:p>
-      <w:pPr>
-        <w:pStyle w:val="ListParagraph"/>
-        <w:numPr>
-          <w:ilvl w:val="0"/>
-          <w:numId w:val="2"/>
-        </w:numPr>
-      </w:pPr>
-      <w:r>
-        <w:t xml:space="preserve">[ ] Proceed through Research Management or the designated MGB submission route.</w:t>
-      </w:r>
-    </w:p>
-    <w:p>
-      <w:pPr>
-        <w:pStyle w:val="ListParagraph"/>
-        <w:numPr>
-          <w:ilvl w:val="0"/>
-          <w:numId w:val="2"/>
-        </w:numPr>
-      </w:pPr>
-      <w:r>
-        <w:t xml:space="preserve">[ ] Proceed after the listed conditions are met.</w:t>
-      </w:r>
-    </w:p>
-    <w:p>
-      <w:pPr>
-        <w:pStyle w:val="ListParagraph"/>
-        <w:numPr>
-          <w:ilvl w:val="0"/>
-          <w:numId w:val="2"/>
-        </w:numPr>
-      </w:pPr>
-      <w:r>
-        <w:rPr>
-          <w:b/>
-          <w:bCs/>
-        </w:rPr>
-        <w:t xml:space="preserve">[ ] Route outside Research Management to:</w:t>
-      </w:r>
-      <w:r>
-        <w:t xml:space="preserve"> ______________________________</w:t>
-      </w:r>
-    </w:p>
-    <w:p>
-      <w:pPr>
-        <w:pStyle w:val="ListParagraph"/>
-        <w:numPr>
-          <w:ilvl w:val="0"/>
-          <w:numId w:val="2"/>
-        </w:numPr>
-      </w:pPr>
-      <w:r>
-        <w:t xml:space="preserve">[ ] Do not proceed.</w:t>
-      </w:r>
-    </w:p>
-    <w:p>
-      <w:r>
-        <w:rPr>
-          <w:b/>
-          <w:bCs/>
-        </w:rPr>
-        <w:t xml:space="preserve">Conditions, owner, and due date:</w:t>
-      </w:r>
-      <w:r>
-        <w:t xml:space="preserve"> _________________________________________</w:t>
-      </w:r>
-    </w:p>
-    <w:p>
-      <w:r>
-        <w:rPr>
-          <w:b/>
-          <w:bCs/>
-        </w:rPr>
-        <w:t xml:space="preserve">Administrative owner:</w:t>
+        <w:t xml:space="preserve">Institutional determinations</w:t>
+      </w:r>
+    </w:p>
+    <w:p>
+      <w:pPr>
+        <w:ind w:left="280"/>
+      </w:pPr>
+      <w:r>
+        <w:t xml:space="preserve">[ ] The Lead Entity is eligible to enter the Residency Program category through HAEMR, ACGME program 1102421150.</w:t>
+      </w:r>
+    </w:p>
+    <w:p>
+      <w:pPr>
+        <w:ind w:left="280"/>
+      </w:pPr>
+      <w:r>
+        <w:t xml:space="preserve">[ ] This is the Lead Entity's only entry to the challenge, whether submitted alone or through a formal partnership.</w:t>
+      </w:r>
+    </w:p>
+    <w:p>
+      <w:pPr>
+        <w:ind w:left="280"/>
+      </w:pPr>
+      <w:r>
+        <w:t xml:space="preserve">[ ] The entry will be submitted as a single-Entity entry with no formal Partner Entity unless a later written approval changes that structure.</w:t>
+      </w:r>
+    </w:p>
+    <w:p>
+      <w:pPr>
+        <w:ind w:left="280"/>
+      </w:pPr>
+      <w:r>
+        <w:t xml:space="preserve">[ ] Mass General Brigham University Healthcare Data Analytics may be named as an internal academic collaborator.</w:t>
+      </w:r>
+    </w:p>
+    <w:p>
+      <w:pPr>
+        <w:ind w:left="280"/>
+      </w:pPr>
+      <w:r>
+        <w:t xml:space="preserve">[ ] The Participant Agreement and its public-use terms have been reviewed or routed to the responsible reviewer.</w:t>
+      </w:r>
+    </w:p>
+    <w:p>
+      <w:pPr>
+        <w:ind w:left="280"/>
+      </w:pPr>
+      <w:r>
+        <w:t xml:space="preserve">[ ] No federal grant, cooperative agreement, or other transaction funds will support preparation of the entry.</w:t>
+      </w:r>
+    </w:p>
+    <w:p>
+      <w:pPr>
+        <w:ind w:left="280"/>
+      </w:pPr>
+      <w:r>
+        <w:t xml:space="preserve">[ ] The institutional route for receiving and administering any prize has been identified.</w:t>
+      </w:r>
+    </w:p>
+    <w:p>
+      <w:pPr>
+        <w:pStyle w:val="Heading1"/>
+      </w:pPr>
+      <w:r>
+        <w:t xml:space="preserve">Point of Contact authorization</w:t>
+      </w:r>
+    </w:p>
+    <w:p>
+      <w:r>
+        <w:rPr>
+          <w:b/>
+          <w:bCs/>
+        </w:rPr>
+        <w:t xml:space="preserve">Authorized Point of Contact:</w:t>
+      </w:r>
+      <w:r>
+        <w:t xml:space="preserve"> ___________________________________________</w:t>
+      </w:r>
+    </w:p>
+    <w:p>
+      <w:r>
+        <w:rPr>
+          <w:b/>
+          <w:bCs/>
+        </w:rPr>
+        <w:t xml:space="preserve">Title and department:</w:t>
       </w:r>
       <w:r>
         <w:t xml:space="preserve"> __________________________________________________</w:t>
@@ -1216,10 +1276,38 @@
           <w:b/>
           <w:bCs/>
         </w:rPr>
-        <w:t xml:space="preserve">Decision date:</w:t>
-      </w:r>
-      <w:r>
-        <w:t xml:space="preserve"> __________________________________________________________</w:t>
+        <w:t xml:space="preserve">Email:</w:t>
+      </w:r>
+      <w:r>
+        <w:t xml:space="preserve"> _________________________________________________________________</w:t>
+      </w:r>
+    </w:p>
+    <w:p>
+      <w:r>
+        <w:rPr>
+          <w:b/>
+          <w:bCs/>
+        </w:rPr>
+        <w:t xml:space="preserve">Phone:</w:t>
+      </w:r>
+      <w:r>
+        <w:t xml:space="preserve"> _________________________________________________________________</w:t>
+      </w:r>
+    </w:p>
+    <w:p>
+      <w:pPr>
+        <w:ind w:left="280"/>
+      </w:pPr>
+      <w:r>
+        <w:t xml:space="preserve">[ ] The Point of Contact may register the Lead Entity, communicate with the challenge administrator, coordinate the institutional package, and submit materials after final MGB approval.</w:t>
+      </w:r>
+    </w:p>
+    <w:p>
+      <w:pPr>
+        <w:ind w:left="280"/>
+      </w:pPr>
+      <w:r>
+        <w:t xml:space="preserve">[ ] The Point of Contact may not change the approved institutional structure, accept terms, or make new institutional commitments without additional authorization.</w:t>
       </w:r>
     </w:p>
     <w:p>
@@ -1227,42 +1315,216 @@
         <w:pStyle w:val="Heading1"/>
       </w:pPr>
       <w:r>
-        <w:t xml:space="preserve">Institutional sources</w:t>
-      </w:r>
-    </w:p>
-    <w:p>
-      <w:r>
-        <w:rPr>
-          <w:b/>
-          <w:bCs/>
-        </w:rPr>
-        <w:t xml:space="preserve">MGB Research Management: </w:t>
-      </w:r>
-      <w:hyperlink w:history="1" r:id="rIdkpjhzbqrbphqlklsgm-gw">
-        <w:r>
-          <w:rPr>
-            <w:rStyle w:val="Hyperlink"/>
-          </w:rPr>
-          <w:t xml:space="preserve">https://research.massgeneralbrigham.org/en/researchers-and-collaborators/collaborators-sponsors/research-management</w:t>
-        </w:r>
-      </w:hyperlink>
-    </w:p>
-    <w:p>
-      <w:r>
-        <w:rPr>
-          <w:b/>
-          <w:bCs/>
-        </w:rPr>
-        <w:t xml:space="preserve">MGB Institutional Information: </w:t>
-      </w:r>
-      <w:hyperlink w:history="1" r:id="rIdtpznphtaxl3ozg2qgfzsr">
-        <w:r>
-          <w:rPr>
-            <w:rStyle w:val="Hyperlink"/>
-          </w:rPr>
-          <w:t xml:space="preserve">https://research.massgeneralbrigham.org/en/researchers-and-collaborators/collaborators-sponsors/institutional-information</w:t>
-        </w:r>
-      </w:hyperlink>
+        <w:t xml:space="preserve">Participant Agreement signer</w:t>
+      </w:r>
+    </w:p>
+    <w:p>
+      <w:r>
+        <w:rPr>
+          <w:b/>
+          <w:bCs/>
+        </w:rPr>
+        <w:t xml:space="preserve">Authorized signer name:</w:t>
+      </w:r>
+      <w:r>
+        <w:t xml:space="preserve"> ________________________________________________</w:t>
+      </w:r>
+    </w:p>
+    <w:p>
+      <w:r>
+        <w:rPr>
+          <w:b/>
+          <w:bCs/>
+        </w:rPr>
+        <w:t xml:space="preserve">Title:</w:t>
+      </w:r>
+      <w:r>
+        <w:t xml:space="preserve"> _________________________________________________________________</w:t>
+      </w:r>
+    </w:p>
+    <w:p>
+      <w:r>
+        <w:rPr>
+          <w:b/>
+          <w:bCs/>
+        </w:rPr>
+        <w:t xml:space="preserve">Office:</w:t>
+      </w:r>
+      <w:r>
+        <w:t xml:space="preserve"> ________________________________________________________________</w:t>
+      </w:r>
+    </w:p>
+    <w:p>
+      <w:r>
+        <w:rPr>
+          <w:b/>
+          <w:bCs/>
+        </w:rPr>
+        <w:t xml:space="preserve">Email:</w:t>
+      </w:r>
+      <w:r>
+        <w:t xml:space="preserve"> _________________________________________________________________</w:t>
+      </w:r>
+    </w:p>
+    <w:p>
+      <w:r>
+        <w:rPr>
+          <w:b/>
+          <w:bCs/>
+        </w:rPr>
+        <w:t xml:space="preserve">Required signing sequence or conditions:</w:t>
+      </w:r>
+      <w:r>
+        <w:t xml:space="preserve"> _______________________________</w:t>
+      </w:r>
+    </w:p>
+    <w:p>
+      <w:pPr>
+        <w:pStyle w:val="Heading1"/>
+      </w:pPr>
+      <w:r>
+        <w:t xml:space="preserve">Approval record</w:t>
+      </w:r>
+    </w:p>
+    <w:p>
+      <w:r>
+        <w:t xml:space="preserve">Research Management or designated institutional official</w:t>
+      </w:r>
+    </w:p>
+    <w:p>
+      <w:r>
+        <w:rPr>
+          <w:b/>
+          <w:bCs/>
+        </w:rPr>
+        <w:t xml:space="preserve">Name and title:</w:t>
+      </w:r>
+      <w:r>
+        <w:t xml:space="preserve"> ________________________________________________________</w:t>
+      </w:r>
+    </w:p>
+    <w:p>
+      <w:r>
+        <w:rPr>
+          <w:b/>
+          <w:bCs/>
+        </w:rPr>
+        <w:t xml:space="preserve">Decision:</w:t>
+      </w:r>
+      <w:r>
+        <w:t xml:space="preserve"> [ ] Approve  [ ] Approve with conditions  [ ] Do not approve</w:t>
+      </w:r>
+    </w:p>
+    <w:p>
+      <w:r>
+        <w:rPr>
+          <w:b/>
+          <w:bCs/>
+        </w:rPr>
+        <w:t xml:space="preserve">Signature and date:</w:t>
+      </w:r>
+      <w:r>
+        <w:t xml:space="preserve"> ____________________________________________________</w:t>
+      </w:r>
+    </w:p>
+    <w:p>
+      <w:r>
+        <w:rPr>
+          <w:b/>
+          <w:bCs/>
+        </w:rPr>
+        <w:t xml:space="preserve">Conditions:</w:t>
+      </w:r>
+      <w:r>
+        <w:t xml:space="preserve"> ____________________________________________________________</w:t>
+      </w:r>
+    </w:p>
+    <w:p>
+      <w:r>
+        <w:t xml:space="preserve">Graduate Medical Education or HAEMR program authority</w:t>
+      </w:r>
+    </w:p>
+    <w:p>
+      <w:r>
+        <w:rPr>
+          <w:b/>
+          <w:bCs/>
+        </w:rPr>
+        <w:t xml:space="preserve">Name and title:</w:t>
+      </w:r>
+      <w:r>
+        <w:t xml:space="preserve"> ________________________________________________________</w:t>
+      </w:r>
+    </w:p>
+    <w:p>
+      <w:r>
+        <w:rPr>
+          <w:b/>
+          <w:bCs/>
+        </w:rPr>
+        <w:t xml:space="preserve">Decision:</w:t>
+      </w:r>
+      <w:r>
+        <w:t xml:space="preserve"> [ ] Confirm participation  [ ] Confirm with conditions  [ ] Do not confirm</w:t>
+      </w:r>
+    </w:p>
+    <w:p>
+      <w:r>
+        <w:rPr>
+          <w:b/>
+          <w:bCs/>
+        </w:rPr>
+        <w:t xml:space="preserve">Signature and date:</w:t>
+      </w:r>
+      <w:r>
+        <w:t xml:space="preserve"> ____________________________________________________</w:t>
+      </w:r>
+    </w:p>
+    <w:p>
+      <w:r>
+        <w:t xml:space="preserve">MGB Department of Emergency Medicine</w:t>
+      </w:r>
+    </w:p>
+    <w:p>
+      <w:r>
+        <w:rPr>
+          <w:b/>
+          <w:bCs/>
+        </w:rPr>
+        <w:t xml:space="preserve">Name and title:</w:t>
+      </w:r>
+      <w:r>
+        <w:t xml:space="preserve"> ________________________________________________________</w:t>
+      </w:r>
+    </w:p>
+    <w:p>
+      <w:r>
+        <w:rPr>
+          <w:b/>
+          <w:bCs/>
+        </w:rPr>
+        <w:t xml:space="preserve">Decision:</w:t>
+      </w:r>
+      <w:r>
+        <w:t xml:space="preserve"> [ ] Confirm sponsorship  [ ] Confirm with conditions  [ ] Do not confirm</w:t>
+      </w:r>
+    </w:p>
+    <w:p>
+      <w:r>
+        <w:rPr>
+          <w:b/>
+          <w:bCs/>
+        </w:rPr>
+        <w:t xml:space="preserve">Signature and date:</w:t>
+      </w:r>
+      <w:r>
+        <w:t xml:space="preserve"> ____________________________________________________</w:t>
+      </w:r>
+    </w:p>
+    <w:p>
+      <w:r>
+        <w:t xml:space="preserve">This record documents MGB's internal authorization. It does not replace the official NIH Participant Agreement.</w:t>
+      </w:r>
     </w:p>
     <w:sectPr>
       <w:headerReference w:type="default" r:id="rId7"/>

</xml_diff>

<commit_message>
docs: scope nutrition curriculum delivery model
</commit_message>
<xml_diff>
--- a/docs/submission/administrative/word/01-mgb-research-management-intake.docx
+++ b/docs/submission/administrative/word/01-mgb-research-management-intake.docx
@@ -76,7 +76,12 @@
     </w:p>
     <w:p>
       <w:r>
-        <w:t xml:space="preserve">The submission would use the Harvard Affiliated Emergency Medicine Residency as the educational setting. The MGB Department of Emergency Medicine would build and coordinate the curriculum. The Mass General Brigham University Healthcare Data Analytics Program would contribute applied analytics and assessment design as an internal collaborator.</w:t>
+        <w:t xml:space="preserve">The Mass General Brigham University Healthcare Data Analytics Program would create the nutrition curriculum, including its applied analytics and assessment design. The Harvard Affiliated Emergency Medicine Residency would be the educational setting. The MGB Department of Emergency Medicine would sponsor the submission and coordinate residency implementation.</w:t>
+      </w:r>
+    </w:p>
+    <w:p>
+      <w:r>
+        <w:t xml:space="preserve">All roles, activities, purchases, and implementation details in this intake are working proposals. The team will revise the curriculum and operating plan to follow the institutional rules and approval path identified by MGB, Mass General Brigham University, Graduate Medical Education, HAEMR, and the Department of Emergency Medicine.</w:t>
       </w:r>
     </w:p>
     <w:p>
@@ -220,7 +225,7 @@
         </w:rPr>
         <w:t xml:space="preserve">Official challenge: </w:t>
       </w:r>
-      <w:hyperlink w:history="1" r:id="rIdlhggtatvxefnt9shyhi3u">
+      <w:hyperlink w:history="1" r:id="rIddiavfn1z9ysgbz_rrskiu">
         <w:r>
           <w:rPr>
             <w:rStyle w:val="Hyperlink"/>
@@ -237,7 +242,7 @@
         </w:rPr>
         <w:t xml:space="preserve">Official Submission Guide: </w:t>
       </w:r>
-      <w:hyperlink w:history="1" r:id="rId2r0tuy6vnt2ysy7a8agv0">
+      <w:hyperlink w:history="1" r:id="rIdu_9nr8aj5660mkmp2ft5h">
         <w:r>
           <w:rPr>
             <w:rStyle w:val="Hyperlink"/>
@@ -254,7 +259,7 @@
         </w:rPr>
         <w:t xml:space="preserve">Official Participant Agreement: </w:t>
       </w:r>
-      <w:hyperlink w:history="1" r:id="rIdulyoxun9s4ntfhgvcpk2-">
+      <w:hyperlink w:history="1" r:id="rIdpnuzz_unatao4gb1x-svj">
         <w:r>
           <w:rPr>
             <w:rStyle w:val="Hyperlink"/>
@@ -337,7 +342,7 @@
           <w:b/>
           <w:bCs/>
         </w:rPr>
-        <w:t xml:space="preserve">Internal builder and coordinator:</w:t>
+        <w:t xml:space="preserve">Institutional sponsor and submission coordinator:</w:t>
       </w:r>
       <w:r>
         <w:t xml:space="preserve"> MGB Department of Emergency Medicine</w:t>
@@ -349,7 +354,7 @@
           <w:b/>
           <w:bCs/>
         </w:rPr>
-        <w:t xml:space="preserve">Educational setting and implementation owner:</w:t>
+        <w:t xml:space="preserve">Educational setting and implementation partner:</w:t>
       </w:r>
       <w:r>
         <w:t xml:space="preserve"> Harvard Affiliated Emergency Medicine Residency</w:t>
@@ -361,7 +366,7 @@
           <w:b/>
           <w:bCs/>
         </w:rPr>
-        <w:t xml:space="preserve">Internal academic collaborator:</w:t>
+        <w:t xml:space="preserve">Curriculum creator and academic lead:</w:t>
       </w:r>
       <w:r>
         <w:t xml:space="preserve"> Mass General Brigham University Healthcare Data Analytics Program</w:t>
@@ -373,6 +378,18 @@
           <w:b/>
           <w:bCs/>
         </w:rPr>
+        <w:t xml:space="preserve">Proposed curriculum delivery purchaser:</w:t>
+      </w:r>
+      <w:r>
+        <w:t xml:space="preserve"> Healthcare Data Analytics through the institutional purchasing route designated by MGB, if approved</w:t>
+      </w:r>
+    </w:p>
+    <w:p>
+      <w:r>
+        <w:rPr>
+          <w:b/>
+          <w:bCs/>
+        </w:rPr>
         <w:t xml:space="preserve">Proposed Point of Contact:</w:t>
       </w:r>
       <w:r>
@@ -388,7 +405,7 @@
         <w:t xml:space="preserve">Formal Partner Entities:</w:t>
       </w:r>
       <w:r>
-        <w:t xml:space="preserve"> None proposed. MGB University is treated as an internal collaborator unless Research Management or legal counsel directs otherwise.</w:t>
+        <w:t xml:space="preserve"> None proposed. The MGB University program role is treated as internal to the MGB submission unless Research Management or legal counsel directs otherwise.</w:t>
       </w:r>
     </w:p>
     <w:p>
@@ -429,7 +446,7 @@
         </w:rPr>
         <w:t xml:space="preserve">AMA FREIDA program record: </w:t>
       </w:r>
-      <w:hyperlink w:history="1" r:id="rIdqesvh_-apdgyvpgaiyrju">
+      <w:hyperlink w:history="1" r:id="rIdybyfi2ooaryrxd8calkov">
         <w:r>
           <w:rPr>
             <w:rStyle w:val="Hyperlink"/>
@@ -446,7 +463,7 @@
         </w:rPr>
         <w:t xml:space="preserve">NRMP program record: </w:t>
       </w:r>
-      <w:hyperlink w:history="1" r:id="rId3zmdrdddls7hv1toukdpx">
+      <w:hyperlink w:history="1" r:id="rIdokkpr0lsjkuvzonnyb_cx">
         <w:r>
           <w:rPr>
             <w:rStyle w:val="Hyperlink"/>
@@ -484,7 +501,7 @@
         <w:t xml:space="preserve">Educational product:</w:t>
       </w:r>
       <w:r>
-        <w:t xml:space="preserve"> A proposed 40-hour longitudinal curriculum for emergency medicine residents that maps 16 HHS nutrition competencies across six domains to case-based learning, applied data analysis, and observable assessments.</w:t>
+        <w:t xml:space="preserve"> A proposed 40-hour longitudinal curriculum created by Healthcare Data Analytics for emergency medicine residents. It maps 16 HHS nutrition competencies across six domains to food-centered learning, clinical cases, applied data analysis, and observable assessments.</w:t>
       </w:r>
     </w:p>
     <w:p>
@@ -496,7 +513,7 @@
         <w:t xml:space="preserve">Development environment:</w:t>
       </w:r>
       <w:r>
-        <w:t xml:space="preserve"> The Department of Emergency Medicine project team may use an approved MGB Azure environment for internal development. The public curriculum will not require MGB credentials, MGB Azure access, or proprietary software.</w:t>
+        <w:t xml:space="preserve"> The project team may use an approved MGB Azure environment for internal development. The public curriculum will not require MGB credentials, MGB Azure access, or proprietary software.</w:t>
       </w:r>
     </w:p>
     <w:p>
@@ -517,6 +534,30 @@
           <w:b/>
           <w:bCs/>
         </w:rPr>
+        <w:t xml:space="preserve">Resident learning sessions:</w:t>
+      </w:r>
+      <w:r>
+        <w:t xml:space="preserve"> HAEMR residents would participate in scheduled educational activities. If the entry is selected and MGB approves the expense, some sessions may include food purchased for use in the nutrition curriculum.</w:t>
+      </w:r>
+    </w:p>
+    <w:p>
+      <w:r>
+        <w:rPr>
+          <w:b/>
+          <w:bCs/>
+        </w:rPr>
+        <w:t xml:space="preserve">Proposed operating model:</w:t>
+      </w:r>
+      <w:r>
+        <w:t xml:space="preserve"> Healthcare Data Analytics would create the curriculum and, if the entry is selected and MGB approves the expense, would use the designated institutional purchasing route to obtain food for scheduled resident nutrition sessions and other teaching materials.</w:t>
+      </w:r>
+    </w:p>
+    <w:p>
+      <w:r>
+        <w:rPr>
+          <w:b/>
+          <w:bCs/>
+        </w:rPr>
         <w:t xml:space="preserve">Public delivery:</w:t>
       </w:r>
       <w:r>
@@ -538,6 +579,8 @@
     </w:p>
     <w:p>
       <w:pPr>
+        <w:pStyle w:val="Normal"/>
+        <w:spacing w:after="100" w:line="264"/>
         <w:ind w:left="280"/>
       </w:pPr>
       <w:r>
@@ -553,6 +596,8 @@
     </w:p>
     <w:p>
       <w:pPr>
+        <w:pStyle w:val="Normal"/>
+        <w:spacing w:after="100" w:line="264"/>
         <w:ind w:left="280"/>
       </w:pPr>
       <w:r>
@@ -561,6 +606,8 @@
     </w:p>
     <w:p>
       <w:pPr>
+        <w:pStyle w:val="Normal"/>
+        <w:spacing w:after="100" w:line="264"/>
         <w:ind w:left="280"/>
       </w:pPr>
       <w:r>
@@ -569,6 +616,8 @@
     </w:p>
     <w:p>
       <w:pPr>
+        <w:pStyle w:val="Normal"/>
+        <w:spacing w:after="100" w:line="264"/>
         <w:ind w:left="280"/>
       </w:pPr>
       <w:r>
@@ -577,6 +626,8 @@
     </w:p>
     <w:p>
       <w:pPr>
+        <w:pStyle w:val="Normal"/>
+        <w:spacing w:after="100" w:line="264"/>
         <w:ind w:left="280"/>
       </w:pPr>
       <w:r>
@@ -585,6 +636,8 @@
     </w:p>
     <w:p>
       <w:pPr>
+        <w:pStyle w:val="Normal"/>
+        <w:spacing w:after="100" w:line="264"/>
         <w:ind w:left="280"/>
       </w:pPr>
       <w:r>
@@ -593,6 +646,8 @@
     </w:p>
     <w:p>
       <w:pPr>
+        <w:pStyle w:val="Normal"/>
+        <w:spacing w:after="100" w:line="264"/>
         <w:ind w:left="280"/>
       </w:pPr>
       <w:r>
@@ -601,6 +656,8 @@
     </w:p>
     <w:p>
       <w:pPr>
+        <w:pStyle w:val="Normal"/>
+        <w:spacing w:after="100" w:line="264"/>
         <w:ind w:left="280"/>
       </w:pPr>
       <w:r>
@@ -609,6 +666,8 @@
     </w:p>
     <w:p>
       <w:pPr>
+        <w:pStyle w:val="Normal"/>
+        <w:spacing w:after="100" w:line="264"/>
         <w:ind w:left="280"/>
       </w:pPr>
       <w:r>
@@ -617,6 +676,8 @@
     </w:p>
     <w:p>
       <w:pPr>
+        <w:pStyle w:val="Normal"/>
+        <w:spacing w:after="100" w:line="264"/>
         <w:ind w:left="280"/>
       </w:pPr>
       <w:r>
@@ -632,6 +693,8 @@
     </w:p>
     <w:p>
       <w:pPr>
+        <w:pStyle w:val="Normal"/>
+        <w:spacing w:after="100" w:line="264"/>
         <w:ind w:left="280"/>
       </w:pPr>
       <w:r>
@@ -716,6 +779,8 @@
     </w:p>
     <w:p>
       <w:pPr>
+        <w:pStyle w:val="Normal"/>
+        <w:spacing w:after="100" w:line="264"/>
         <w:ind w:left="280"/>
       </w:pPr>
       <w:r>
@@ -724,6 +789,8 @@
     </w:p>
     <w:p>
       <w:pPr>
+        <w:pStyle w:val="Normal"/>
+        <w:spacing w:after="100" w:line="264"/>
         <w:ind w:left="280"/>
       </w:pPr>
       <w:r>
@@ -732,6 +799,8 @@
     </w:p>
     <w:p>
       <w:pPr>
+        <w:pStyle w:val="Normal"/>
+        <w:spacing w:after="100" w:line="264"/>
         <w:ind w:left="280"/>
       </w:pPr>
       <w:r>
@@ -740,6 +809,8 @@
     </w:p>
     <w:p>
       <w:pPr>
+        <w:pStyle w:val="Normal"/>
+        <w:spacing w:after="100" w:line="264"/>
         <w:ind w:left="280"/>
       </w:pPr>
       <w:r>
@@ -748,6 +819,8 @@
     </w:p>
     <w:p>
       <w:pPr>
+        <w:pStyle w:val="Normal"/>
+        <w:spacing w:after="100" w:line="264"/>
         <w:ind w:left="280"/>
       </w:pPr>
       <w:r>
@@ -756,14 +829,18 @@
     </w:p>
     <w:p>
       <w:pPr>
-        <w:ind w:left="280"/>
-      </w:pPr>
-      <w:r>
-        <w:t xml:space="preserve">[ ] May MGB University Healthcare Data Analytics be listed as an internal collaborator without formal Partner Entity status?</w:t>
-      </w:r>
-    </w:p>
-    <w:p>
-      <w:pPr>
+        <w:pStyle w:val="Normal"/>
+        <w:spacing w:after="100" w:line="264"/>
+        <w:ind w:left="280"/>
+      </w:pPr>
+      <w:r>
+        <w:t xml:space="preserve">[ ] May MGB University Healthcare Data Analytics be listed as the internal curriculum creator and academic lead without formal Partner Entity status?</w:t>
+      </w:r>
+    </w:p>
+    <w:p>
+      <w:pPr>
+        <w:pStyle w:val="Normal"/>
+        <w:spacing w:after="100" w:line="264"/>
         <w:ind w:left="280"/>
       </w:pPr>
       <w:r>
@@ -772,6 +849,8 @@
     </w:p>
     <w:p>
       <w:pPr>
+        <w:pStyle w:val="Normal"/>
+        <w:spacing w:after="100" w:line="264"/>
         <w:ind w:left="280"/>
       </w:pPr>
       <w:r>
@@ -780,6 +859,8 @@
     </w:p>
     <w:p>
       <w:pPr>
+        <w:pStyle w:val="Normal"/>
+        <w:spacing w:after="100" w:line="264"/>
         <w:ind w:left="280"/>
       </w:pPr>
       <w:r>
@@ -788,6 +869,8 @@
     </w:p>
     <w:p>
       <w:pPr>
+        <w:pStyle w:val="Normal"/>
+        <w:spacing w:after="100" w:line="264"/>
         <w:ind w:left="280"/>
       </w:pPr>
       <w:r>
@@ -796,6 +879,18 @@
     </w:p>
     <w:p>
       <w:pPr>
+        <w:pStyle w:val="Normal"/>
+        <w:spacing w:after="100" w:line="264"/>
+        <w:ind w:left="280"/>
+      </w:pPr>
+      <w:r>
+        <w:t xml:space="preserve">[ ] If selected, may an approved institutional account pay for food used in scheduled resident nutrition sessions and other curriculum delivery expenses?</w:t>
+      </w:r>
+    </w:p>
+    <w:p>
+      <w:pPr>
+        <w:pStyle w:val="Normal"/>
+        <w:spacing w:after="100" w:line="264"/>
         <w:ind w:left="280"/>
       </w:pPr>
       <w:r>
@@ -918,7 +1013,7 @@
         </w:numPr>
       </w:pPr>
       <w:r>
-        <w:t xml:space="preserve">Confirm that HAEMR may be named in the submission and may participate in curriculum development and implementation.</w:t>
+        <w:t xml:space="preserve">Confirm that HAEMR may be named in the submission and may implement the curriculum in scheduled resident education.</w:t>
       </w:r>
     </w:p>
     <w:p>
@@ -935,7 +1030,7 @@
         </w:numPr>
       </w:pPr>
       <w:r>
-        <w:t xml:space="preserve">Confirm departmental sponsorship of the proposed submission and the Department's builder and coordination role.</w:t>
+        <w:t xml:space="preserve">Confirm departmental sponsorship of the proposed submission and the Department's submission coordination and implementation role.</w:t>
       </w:r>
     </w:p>
     <w:p>
@@ -952,7 +1047,7 @@
     </w:p>
     <w:p>
       <w:r>
-        <w:t xml:space="preserve">Research Finance or designated financial office</w:t>
+        <w:t xml:space="preserve">Mass General Brigham University Healthcare Data Analytics Program</w:t>
       </w:r>
     </w:p>
     <w:p>
@@ -964,15 +1059,12 @@
         </w:numPr>
       </w:pPr>
       <w:r>
-        <w:t xml:space="preserve">Confirm the institutional prize acceptance and account route if selected.</w:t>
-      </w:r>
-    </w:p>
-    <w:p>
-      <w:pPr>
-        <w:pStyle w:val="Heading1"/>
-      </w:pPr>
-      <w:r>
-        <w:t xml:space="preserve">Materials available for review</w:t>
+        <w:t xml:space="preserve">Confirm responsibility for curriculum creation, applied analytics, visualization, reproducibility, and assessment design, plus any approved curriculum delivery purchases routed through the program.</w:t>
+      </w:r>
+    </w:p>
+    <w:p>
+      <w:r>
+        <w:t xml:space="preserve">Research Finance or designated financial office</w:t>
       </w:r>
     </w:p>
     <w:p>
@@ -984,7 +1076,7 @@
         </w:numPr>
       </w:pPr>
       <w:r>
-        <w:t xml:space="preserve">Official NIH challenge rules, Submission Guide, and Participant Agreement.</w:t>
+        <w:t xml:space="preserve">Confirm the institutional prize acceptance and account route if selected.</w:t>
       </w:r>
     </w:p>
     <w:p>
@@ -996,7 +1088,15 @@
         </w:numPr>
       </w:pPr>
       <w:r>
-        <w:t xml:space="preserve">Current HAEMR national program records.</w:t>
+        <w:t xml:space="preserve">Confirm the purchasing route for approved curriculum delivery expenses, including food used in scheduled resident nutrition sessions.</w:t>
+      </w:r>
+    </w:p>
+    <w:p>
+      <w:pPr>
+        <w:pStyle w:val="Heading1"/>
+      </w:pPr>
+      <w:r>
+        <w:t xml:space="preserve">Materials available for review</w:t>
       </w:r>
     </w:p>
     <w:p>
@@ -1008,7 +1108,7 @@
         </w:numPr>
       </w:pPr>
       <w:r>
-        <w:t xml:space="preserve">North Star specification and 40-hour HHS competency crosswalk.</w:t>
+        <w:t xml:space="preserve">Official NIH challenge rules, Submission Guide, and Participant Agreement.</w:t>
       </w:r>
     </w:p>
     <w:p>
@@ -1020,6 +1120,30 @@
         </w:numPr>
       </w:pPr>
       <w:r>
+        <w:t xml:space="preserve">Current HAEMR national program records.</w:t>
+      </w:r>
+    </w:p>
+    <w:p>
+      <w:pPr>
+        <w:pStyle w:val="ListParagraph"/>
+        <w:numPr>
+          <w:ilvl w:val="0"/>
+          <w:numId w:val="2"/>
+        </w:numPr>
+      </w:pPr>
+      <w:r>
+        <w:t xml:space="preserve">North Star specification and 40-hour HHS competency crosswalk.</w:t>
+      </w:r>
+    </w:p>
+    <w:p>
+      <w:pPr>
+        <w:pStyle w:val="ListParagraph"/>
+        <w:numPr>
+          <w:ilvl w:val="0"/>
+          <w:numId w:val="2"/>
+        </w:numPr>
+      </w:pPr>
+      <w:r>
         <w:t xml:space="preserve">Draft Curriculum Overview and Nutrition Education Toolkit as they are completed.</w:t>
       </w:r>
     </w:p>
@@ -1033,6 +1157,8 @@
     </w:p>
     <w:p>
       <w:pPr>
+        <w:pStyle w:val="Normal"/>
+        <w:spacing w:after="100" w:line="264"/>
         <w:ind w:left="280"/>
       </w:pPr>
       <w:r>
@@ -1041,6 +1167,8 @@
     </w:p>
     <w:p>
       <w:pPr>
+        <w:pStyle w:val="Normal"/>
+        <w:spacing w:after="100" w:line="264"/>
         <w:ind w:left="280"/>
       </w:pPr>
       <w:r>
@@ -1049,6 +1177,8 @@
     </w:p>
     <w:p>
       <w:pPr>
+        <w:pStyle w:val="Normal"/>
+        <w:spacing w:after="100" w:line="264"/>
         <w:ind w:left="280"/>
       </w:pPr>
       <w:r>
@@ -1064,6 +1194,8 @@
     </w:p>
     <w:p>
       <w:pPr>
+        <w:pStyle w:val="Normal"/>
+        <w:spacing w:after="100" w:line="264"/>
         <w:ind w:left="280"/>
       </w:pPr>
       <w:r>
@@ -1184,6 +1316,8 @@
     </w:p>
     <w:p>
       <w:pPr>
+        <w:pStyle w:val="Normal"/>
+        <w:spacing w:after="100" w:line="264"/>
         <w:ind w:left="280"/>
       </w:pPr>
       <w:r>
@@ -1192,6 +1326,8 @@
     </w:p>
     <w:p>
       <w:pPr>
+        <w:pStyle w:val="Normal"/>
+        <w:spacing w:after="100" w:line="264"/>
         <w:ind w:left="280"/>
       </w:pPr>
       <w:r>
@@ -1200,6 +1336,8 @@
     </w:p>
     <w:p>
       <w:pPr>
+        <w:pStyle w:val="Normal"/>
+        <w:spacing w:after="100" w:line="264"/>
         <w:ind w:left="280"/>
       </w:pPr>
       <w:r>
@@ -1208,14 +1346,18 @@
     </w:p>
     <w:p>
       <w:pPr>
-        <w:ind w:left="280"/>
-      </w:pPr>
-      <w:r>
-        <w:t xml:space="preserve">[ ] Mass General Brigham University Healthcare Data Analytics may be named as an internal academic collaborator.</w:t>
-      </w:r>
-    </w:p>
-    <w:p>
-      <w:pPr>
+        <w:pStyle w:val="Normal"/>
+        <w:spacing w:after="100" w:line="264"/>
+        <w:ind w:left="280"/>
+      </w:pPr>
+      <w:r>
+        <w:t xml:space="preserve">[ ] Mass General Brigham University Healthcare Data Analytics may be named as the curriculum creator and academic lead within the MGB submission.</w:t>
+      </w:r>
+    </w:p>
+    <w:p>
+      <w:pPr>
+        <w:pStyle w:val="Normal"/>
+        <w:spacing w:after="100" w:line="264"/>
         <w:ind w:left="280"/>
       </w:pPr>
       <w:r>
@@ -1224,6 +1366,8 @@
     </w:p>
     <w:p>
       <w:pPr>
+        <w:pStyle w:val="Normal"/>
+        <w:spacing w:after="100" w:line="264"/>
         <w:ind w:left="280"/>
       </w:pPr>
       <w:r>
@@ -1232,6 +1376,8 @@
     </w:p>
     <w:p>
       <w:pPr>
+        <w:pStyle w:val="Normal"/>
+        <w:spacing w:after="100" w:line="264"/>
         <w:ind w:left="280"/>
       </w:pPr>
       <w:r>
@@ -1240,6 +1386,16 @@
     </w:p>
     <w:p>
       <w:pPr>
+        <w:pStyle w:val="Normal"/>
+        <w:spacing w:after="100" w:line="264"/>
+        <w:ind w:left="280"/>
+      </w:pPr>
+      <w:r>
+        <w:t xml:space="preserve">[ ] Healthcare Data Analytics may manage approved curriculum delivery expenses through the designated institutional purchasing route if the entry is selected.</w:t>
+      </w:r>
+    </w:p>
+    <w:p>
+      <w:pPr>
         <w:pStyle w:val="Heading1"/>
       </w:pPr>
       <w:r>
@@ -1296,6 +1452,8 @@
     </w:p>
     <w:p>
       <w:pPr>
+        <w:pStyle w:val="Normal"/>
+        <w:spacing w:after="100" w:line="264"/>
         <w:ind w:left="280"/>
       </w:pPr>
       <w:r>
@@ -1304,6 +1462,8 @@
     </w:p>
     <w:p>
       <w:pPr>
+        <w:pStyle w:val="Normal"/>
+        <w:spacing w:after="100" w:line="264"/>
         <w:ind w:left="280"/>
       </w:pPr>
       <w:r>
@@ -1507,6 +1667,47 @@
       </w:r>
       <w:r>
         <w:t xml:space="preserve"> [ ] Confirm sponsorship  [ ] Confirm with conditions  [ ] Do not confirm</w:t>
+      </w:r>
+    </w:p>
+    <w:p>
+      <w:r>
+        <w:rPr>
+          <w:b/>
+          <w:bCs/>
+        </w:rPr>
+        <w:t xml:space="preserve">Signature and date:</w:t>
+      </w:r>
+      <w:r>
+        <w:t xml:space="preserve"> ____________________________________________________</w:t>
+      </w:r>
+    </w:p>
+    <w:p>
+      <w:r>
+        <w:t xml:space="preserve">Mass General Brigham University Healthcare Data Analytics Program</w:t>
+      </w:r>
+    </w:p>
+    <w:p>
+      <w:r>
+        <w:rPr>
+          <w:b/>
+          <w:bCs/>
+        </w:rPr>
+        <w:t xml:space="preserve">Name and title:</w:t>
+      </w:r>
+      <w:r>
+        <w:t xml:space="preserve"> ________________________________________________________</w:t>
+      </w:r>
+    </w:p>
+    <w:p>
+      <w:r>
+        <w:rPr>
+          <w:b/>
+          <w:bCs/>
+        </w:rPr>
+        <w:t xml:space="preserve">Decision:</w:t>
+      </w:r>
+      <w:r>
+        <w:t xml:space="preserve"> [ ] Confirm curriculum creator and delivery role  [ ] Confirm with conditions  [ ] Do not confirm</w:t>
       </w:r>
     </w:p>
     <w:p>

</xml_diff>